<commit_message>
Day 3: problem statement finalised
</commit_message>
<xml_diff>
--- a/Day2_Daily_Lab_Submission.docx
+++ b/Day2_Daily_Lab_Submission.docx
@@ -155,15 +155,16 @@
         <w:tblLook w:firstColumn="1" w:firstRow="1" w:lastColumn="0" w:lastRow="0" w:noHBand="0" w:noVBand="1" w:val="04A0"/>
       </w:tblPr>
       <w:tblGrid>
-        <w:gridCol w:w="2340"/>
-        <w:gridCol w:w="2340"/>
-        <w:gridCol w:w="2340"/>
-        <w:gridCol w:w="2340"/>
+        <w:gridCol w:w="1872"/>
+        <w:gridCol w:w="1872"/>
+        <w:gridCol w:w="1872"/>
+        <w:gridCol w:w="1872"/>
+        <w:gridCol w:w="1872"/>
       </w:tblGrid>
       <w:tr>
         <w:tc>
           <w:tcPr>
-            <w:tcW w:type="dxa" w:w="1984"/>
+            <w:tcW w:type="dxa" w:w="1701"/>
             <w:shd w:fill="003366" w:val="clear"/>
           </w:tcPr>
           <w:p>
@@ -179,7 +180,23 @@
         </w:tc>
         <w:tc>
           <w:tcPr>
-            <w:tcW w:type="dxa" w:w="3402"/>
+            <w:tcW w:type="dxa" w:w="1417"/>
+            <w:shd w:fill="003366" w:val="clear"/>
+          </w:tcPr>
+          <w:p>
+            <w:r>
+              <w:rPr>
+                <w:b/>
+                <w:color w:val="FFFFFF"/>
+                <w:sz w:val="20"/>
+              </w:rPr>
+              <w:t>Link</w:t>
+            </w:r>
+          </w:p>
+        </w:tc>
+        <w:tc>
+          <w:tcPr>
+            <w:tcW w:type="dxa" w:w="3118"/>
             <w:shd w:fill="003366" w:val="clear"/>
           </w:tcPr>
           <w:p>
@@ -195,7 +212,7 @@
         </w:tc>
         <w:tc>
           <w:tcPr>
-            <w:tcW w:type="dxa" w:w="1984"/>
+            <w:tcW w:type="dxa" w:w="1644"/>
             <w:shd w:fill="003366" w:val="clear"/>
           </w:tcPr>
           <w:p>
@@ -205,13 +222,13 @@
                 <w:color w:val="FFFFFF"/>
                 <w:sz w:val="20"/>
               </w:rPr>
-              <w:t>Question Answered</w:t>
+              <w:t>Research Question</w:t>
             </w:r>
           </w:p>
         </w:tc>
         <w:tc>
           <w:tcPr>
-            <w:tcW w:type="dxa" w:w="1701"/>
+            <w:tcW w:type="dxa" w:w="1134"/>
             <w:shd w:fill="003366" w:val="clear"/>
           </w:tcPr>
           <w:p>
@@ -229,7 +246,7 @@
       <w:tr>
         <w:tc>
           <w:tcPr>
-            <w:tcW w:type="dxa" w:w="1984"/>
+            <w:tcW w:type="dxa" w:w="1701"/>
           </w:tcPr>
           <w:p>
             <w:r>
@@ -243,7 +260,24 @@
         </w:tc>
         <w:tc>
           <w:tcPr>
-            <w:tcW w:type="dxa" w:w="3402"/>
+            <w:tcW w:type="dxa" w:w="1417"/>
+          </w:tcPr>
+          <w:p>
+            <w:r>
+              <w:rPr>
+                <w:color w:val="0000EE"/>
+                <w:sz w:val="19"/>
+                <w:u w:val="single"/>
+              </w:rPr>
+              <w:t>jica.go.jp</w:t>
+              <w:br/>
+              <w:t>nairobi.go.ke</w:t>
+            </w:r>
+          </w:p>
+        </w:tc>
+        <w:tc>
+          <w:tcPr>
+            <w:tcW w:type="dxa" w:w="3118"/>
           </w:tcPr>
           <w:p>
             <w:r>
@@ -256,7 +290,7 @@
         </w:tc>
         <w:tc>
           <w:tcPr>
-            <w:tcW w:type="dxa" w:w="1984"/>
+            <w:tcW w:type="dxa" w:w="1644"/>
           </w:tcPr>
           <w:p>
             <w:r>
@@ -269,7 +303,7 @@
         </w:tc>
         <w:tc>
           <w:tcPr>
-            <w:tcW w:type="dxa" w:w="1701"/>
+            <w:tcW w:type="dxa" w:w="1134"/>
           </w:tcPr>
           <w:p>
             <w:r>
@@ -284,7 +318,7 @@
       <w:tr>
         <w:tc>
           <w:tcPr>
-            <w:tcW w:type="dxa" w:w="1984"/>
+            <w:tcW w:type="dxa" w:w="1701"/>
             <w:shd w:fill="F2F7FB" w:val="clear"/>
           </w:tcPr>
           <w:p>
@@ -299,7 +333,25 @@
         </w:tc>
         <w:tc>
           <w:tcPr>
-            <w:tcW w:type="dxa" w:w="3402"/>
+            <w:tcW w:type="dxa" w:w="1417"/>
+            <w:shd w:fill="F2F7FB" w:val="clear"/>
+          </w:tcPr>
+          <w:p>
+            <w:r>
+              <w:rPr>
+                <w:color w:val="0000EE"/>
+                <w:sz w:val="19"/>
+                <w:u w:val="single"/>
+              </w:rPr>
+              <w:t>wri.org</w:t>
+              <w:br/>
+              <w:t>ushahidi.com</w:t>
+            </w:r>
+          </w:p>
+        </w:tc>
+        <w:tc>
+          <w:tcPr>
+            <w:tcW w:type="dxa" w:w="3118"/>
             <w:shd w:fill="F2F7FB" w:val="clear"/>
           </w:tcPr>
           <w:p>
@@ -313,7 +365,7 @@
         </w:tc>
         <w:tc>
           <w:tcPr>
-            <w:tcW w:type="dxa" w:w="1984"/>
+            <w:tcW w:type="dxa" w:w="1644"/>
             <w:shd w:fill="F2F7FB" w:val="clear"/>
           </w:tcPr>
           <w:p>
@@ -327,7 +379,7 @@
         </w:tc>
         <w:tc>
           <w:tcPr>
-            <w:tcW w:type="dxa" w:w="1701"/>
+            <w:tcW w:type="dxa" w:w="1134"/>
             <w:shd w:fill="F2F7FB" w:val="clear"/>
           </w:tcPr>
           <w:p>
@@ -343,7 +395,7 @@
       <w:tr>
         <w:tc>
           <w:tcPr>
-            <w:tcW w:type="dxa" w:w="1984"/>
+            <w:tcW w:type="dxa" w:w="1701"/>
           </w:tcPr>
           <w:p>
             <w:r>
@@ -357,7 +409,24 @@
         </w:tc>
         <w:tc>
           <w:tcPr>
-            <w:tcW w:type="dxa" w:w="3402"/>
+            <w:tcW w:type="dxa" w:w="1417"/>
+          </w:tcPr>
+          <w:p>
+            <w:r>
+              <w:rPr>
+                <w:color w:val="0000EE"/>
+                <w:sz w:val="19"/>
+                <w:u w:val="single"/>
+              </w:rPr>
+              <w:t>zerowastekenya.org</w:t>
+              <w:br/>
+              <w:t>cleanupkenya.org</w:t>
+            </w:r>
+          </w:p>
+        </w:tc>
+        <w:tc>
+          <w:tcPr>
+            <w:tcW w:type="dxa" w:w="3118"/>
           </w:tcPr>
           <w:p>
             <w:r>
@@ -370,7 +439,7 @@
         </w:tc>
         <w:tc>
           <w:tcPr>
-            <w:tcW w:type="dxa" w:w="1984"/>
+            <w:tcW w:type="dxa" w:w="1644"/>
           </w:tcPr>
           <w:p>
             <w:r>
@@ -383,7 +452,7 @@
         </w:tc>
         <w:tc>
           <w:tcPr>
-            <w:tcW w:type="dxa" w:w="1701"/>
+            <w:tcW w:type="dxa" w:w="1134"/>
           </w:tcPr>
           <w:p>
             <w:r>

</xml_diff>